<commit_message>
Oppdater rapportkilde og legg til PDF
</commit_message>
<xml_diff>
--- a/014 fase 4 - report/Rapport v2 - redigerbar med lesbare vedlegg.docx
+++ b/014 fase 4 - report/Rapport v2 - redigerbar med lesbare vedlegg.docx
@@ -409,7 +409,7 @@
           <w:sz w:val="32"/>
           <w:szCs w:val="32"/>
         </w:rPr>
-        <w:t>84</w:t>
+        <w:t>97</w:t>
       </w:r>
     </w:p>
     <w:p>
@@ -2110,7 +2110,16 @@
           <w:sz w:val="20"/>
           <w:szCs w:val="20"/>
         </w:rPr>
-        <w:t>Referansenummer: [fylles inn ved behov]</w:t>
+        <w:t xml:space="preserve">Referansenummer: </w:t>
+      </w:r>
+      <w:r>
+        <w:rPr>
+          <w:rFonts w:ascii="Trebuchet MS" w:hAnsi="Trebuchet MS" w:cs="Times New Roman"/>
+          <w:b/>
+          <w:sz w:val="20"/>
+          <w:szCs w:val="20"/>
+        </w:rPr>
+        <w:t>N/A</w:t>
       </w:r>
     </w:p>
     <w:p>
@@ -2308,7 +2317,16 @@
           <w:sz w:val="20"/>
           <w:szCs w:val="20"/>
         </w:rPr>
-        <w:t>Referansenummer: [fylles inn ved behov]</w:t>
+        <w:t xml:space="preserve">Referansenummer: </w:t>
+      </w:r>
+      <w:r>
+        <w:rPr>
+          <w:rFonts w:ascii="Trebuchet MS" w:hAnsi="Trebuchet MS" w:cs="Times New Roman"/>
+          <w:b/>
+          <w:sz w:val="20"/>
+          <w:szCs w:val="20"/>
+        </w:rPr>
+        <w:t>N/A</w:t>
       </w:r>
     </w:p>
     <w:p>
@@ -2378,96 +2396,7 @@
           <w:sz w:val="20"/>
           <w:szCs w:val="20"/>
         </w:rPr>
-        <w:fldChar w:fldCharType="begin">
-          <w:ffData>
-            <w:name w:val="Dato"/>
-            <w:enabled/>
-            <w:calcOnExit w:val="0"/>
-            <w:helpText w:type="text" w:val="1. Klikk i feltet   2. Skriv inn dato"/>
-            <w:statusText w:type="text" w:val="1. Klikk i feltet   2. Skriv inn dato"/>
-            <w:textInput/>
-          </w:ffData>
-        </w:fldChar>
-      </w:r>
-      <w:r>
-        <w:rPr>
-          <w:rFonts w:ascii="Trebuchet MS" w:hAnsi="Trebuchet MS" w:cs="Times New Roman"/>
-          <w:b/>
-          <w:sz w:val="20"/>
-          <w:szCs w:val="20"/>
-        </w:rPr>
-        <w:instrText xml:space="preserve"> FORMTEXT </w:instrText>
-      </w:r>
-      <w:r>
-        <w:rPr>
-          <w:rFonts w:ascii="Trebuchet MS" w:hAnsi="Trebuchet MS" w:cs="Times New Roman"/>
-          <w:b/>
-          <w:sz w:val="20"/>
-          <w:szCs w:val="20"/>
-        </w:rPr>
-      </w:r>
-      <w:r>
-        <w:rPr>
-          <w:rFonts w:ascii="Trebuchet MS" w:hAnsi="Trebuchet MS" w:cs="Times New Roman"/>
-          <w:b/>
-          <w:sz w:val="20"/>
-          <w:szCs w:val="20"/>
-        </w:rPr>
-        <w:fldChar w:fldCharType="separate"/>
-      </w:r>
-      <w:r>
-        <w:rPr>
-          <w:rFonts w:ascii="Trebuchet MS" w:hAnsi="Trebuchet MS" w:cs="Times New Roman"/>
-          <w:b/>
-          <w:sz w:val="20"/>
-          <w:szCs w:val="20"/>
-        </w:rPr>
-        <w:t> </w:t>
-      </w:r>
-      <w:r>
-        <w:rPr>
-          <w:rFonts w:ascii="Trebuchet MS" w:hAnsi="Trebuchet MS" w:cs="Times New Roman"/>
-          <w:b/>
-          <w:sz w:val="20"/>
-          <w:szCs w:val="20"/>
-        </w:rPr>
-        <w:t> </w:t>
-      </w:r>
-      <w:r>
-        <w:rPr>
-          <w:rFonts w:ascii="Trebuchet MS" w:hAnsi="Trebuchet MS" w:cs="Times New Roman"/>
-          <w:b/>
-          <w:sz w:val="20"/>
-          <w:szCs w:val="20"/>
-        </w:rPr>
-        <w:t> </w:t>
-      </w:r>
-      <w:r>
-        <w:rPr>
-          <w:rFonts w:ascii="Trebuchet MS" w:hAnsi="Trebuchet MS" w:cs="Times New Roman"/>
-          <w:b/>
-          <w:sz w:val="20"/>
-          <w:szCs w:val="20"/>
-        </w:rPr>
-        <w:t> </w:t>
-      </w:r>
-      <w:r>
-        <w:rPr>
-          <w:rFonts w:ascii="Trebuchet MS" w:hAnsi="Trebuchet MS" w:cs="Times New Roman"/>
-          <w:b/>
-          <w:sz w:val="20"/>
-          <w:szCs w:val="20"/>
-        </w:rPr>
-        <w:t> </w:t>
-      </w:r>
-      <w:r>
-        <w:rPr>
-          <w:rFonts w:ascii="Trebuchet MS" w:hAnsi="Trebuchet MS" w:cs="Times New Roman"/>
-          <w:b/>
-          <w:sz w:val="20"/>
-          <w:szCs w:val="20"/>
-        </w:rPr>
-        <w:fldChar w:fldCharType="end"/>
+        <w:t>N/A</w:t>
       </w:r>
     </w:p>
     <w:p>
@@ -2924,7 +2853,16 @@
           <w:sz w:val="20"/>
           <w:szCs w:val="20"/>
         </w:rPr>
-        <w:t>Kan oppgaven publiseres når båndleggingsperioden er over? [ja/nei, hvis relevant]</w:t>
+        <w:t xml:space="preserve">Kan oppgaven publiseres når båndleggingsperioden er over? </w:t>
+      </w:r>
+      <w:r>
+        <w:rPr>
+          <w:rFonts w:ascii="Trebuchet MS" w:hAnsi="Trebuchet MS" w:cs="Times New Roman"/>
+          <w:b/>
+          <w:sz w:val="20"/>
+          <w:szCs w:val="20"/>
+        </w:rPr>
+        <w:t>N/A</w:t>
       </w:r>
     </w:p>
     <w:p>
@@ -3044,7 +2982,21 @@
           <w:b/>
         </w:rPr>
         <w:lastRenderedPageBreak/>
-        <w:t>Antall ord: [fylles inn manuelt]</w:t>
+        <w:t xml:space="preserve">Antall ord: </w:t>
+      </w:r>
+      <w:r>
+        <w:rPr>
+          <w:rFonts w:ascii="Trebuchet MS" w:hAnsi="Trebuchet MS" w:cs="Arial"/>
+          <w:b/>
+        </w:rPr>
+        <w:t>18</w:t>
+      </w:r>
+      <w:r>
+        <w:rPr>
+          <w:rFonts w:ascii="Trebuchet MS" w:hAnsi="Trebuchet MS" w:cs="Arial"/>
+          <w:b/>
+        </w:rPr>
+        <w:t>709</w:t>
       </w:r>
     </w:p>
     <w:p>
@@ -11051,7 +11003,16 @@
         <w:t xml:space="preserve"> </w:t>
       </w:r>
       <w:r>
-        <w:t>KI-verktøyene er brukt som hjelpemidler, ikke som erstatning for selvstendig faglig arbeid. Modellvalg, metodeoppsett, tolkning av resultater, diskusjon og endelige formuleringer er gjennomgått, vurdert og kvalitetssikret. Alle resultater som presenteres i oppgaven er kontrollert opp mot datagrunnlaget og modellkjøringene som ligger til grunn for analysen.</w:t>
+        <w:t xml:space="preserve">KI-verktøyene er brukt som hjelpemidler, ikke som erstatning for selvstendig faglig arbeid. Modellvalg, metodeoppsett, tolkning av resultater, diskusjon og endelige formuleringer er gjennomgått, vurdert og kvalitetssikret. </w:t>
+      </w:r>
+      <w:r>
+        <w:t>KI-verktøy er også brukt som støtte i arbeid med kodebaserte visualiseringer og figurer, men de endelige figurene bygger på datagrunnlaget og modellresultatene fra analysen.</w:t>
+      </w:r>
+      <w:r>
+        <w:t xml:space="preserve"> </w:t>
+      </w:r>
+      <w:r>
+        <w:t>Alle resultater som presenteres i oppgaven er kontrollert opp mot datagrunnlaget og modellkjøringene som ligger til grunn for analysen.</w:t>
       </w:r>
     </w:p>
     <w:p>
@@ -18790,26 +18751,26 @@
     <w:p>
       <w:r>
         <w:lastRenderedPageBreak/>
-        <w:t xml:space="preserve">Datasettet er ikke offentlig tilgjengelig, </w:t>
-      </w:r>
-      <w:r>
-        <w:t xml:space="preserve">men de anonymiserte dataene er tilgjengelig i </w:t>
+        <w:t>Rådataene fra virksomheten er ikke offentlig tilgjengelige. Analysefilene som brukes i oppgaven er anonymisert og dokumentert i prosjektets GitHub-</w:t>
       </w:r>
       <w:proofErr w:type="spellStart"/>
       <w:r>
-        <w:t>Github</w:t>
+        <w:t>repo</w:t>
       </w:r>
       <w:proofErr w:type="spellEnd"/>
       <w:r>
+        <w:t xml:space="preserve">, se </w:t>
+      </w:r>
+      <w:proofErr w:type="spellStart"/>
+      <w:r>
+        <w:t>vedleggstabell</w:t>
+      </w:r>
+      <w:proofErr w:type="spellEnd"/>
+      <w:r>
+        <w:t xml:space="preserve"> A2.</w:t>
+      </w:r>
+      <w:r>
         <w:t xml:space="preserve"> </w:t>
-      </w:r>
-      <w:proofErr w:type="spellStart"/>
-      <w:r>
-        <w:t>repoet</w:t>
-      </w:r>
-      <w:proofErr w:type="spellEnd"/>
-      <w:r>
-        <w:t xml:space="preserve">, se vedlegg og tabell A2. </w:t>
       </w:r>
       <w:r>
         <w:t>Dette skyldes at materialet bygger på interne virksomhetsdata. For å sikre transparens beskrives derfor variablene, tidsperioden, databehandlingen og antall observasjoner eksplisitt i oppgaven, slik at analyseopplegget kan forstås og etterprøves metodisk selv om rådataene ikke publiseres åpent.</w:t>
@@ -23119,7 +23080,13 @@
     </w:p>
     <w:p>
       <w:r>
-        <w:t>Alle modeller er evaluert på de samme 225 fartøy-månedene i testperioden fra januar 2025 til mars 2026. MAE brukes som hovedmål, mens RMSE, sMAPE og MASE brukes som støttemål. MASE er skalert mot en naiv lag-1-referanse beregnet fra treningshistorikken per fartøy. Siden datasettet er svært nulltungt, må sMAPE tolkes med forsiktighet; metrikken kan bli ustabil eller svært høy når faktiske og predikerte verdier ligger nær null.</w:t>
+        <w:t xml:space="preserve">Alle modeller er evaluert på de samme 225 fartøy-månedene i testperioden fra januar 2025 til mars 2026. MAE brukes som hovedmål, mens RMSE, sMAPE og MASE brukes som støttemål. MASE er skalert mot en naiv lag-1-referanse beregnet fra treningshistorikken per fartøy. Siden datasettet </w:t>
+      </w:r>
+      <w:r>
+        <w:t xml:space="preserve">også </w:t>
+      </w:r>
+      <w:r>
+        <w:t>er svært nulltungt, må sMAPE tolkes med forsiktighet; metrikken kan bli ustabil eller svært høy når faktiske og predikerte verdier ligger nær null.</w:t>
       </w:r>
     </w:p>
     <w:p>
@@ -23916,16 +23883,16 @@
         <w:rPr>
           <w:i/>
           <w:iCs/>
-          <w:sz w:val="21"/>
-          <w:szCs w:val="20"/>
+          <w:sz w:val="20"/>
+          <w:szCs w:val="18"/>
         </w:rPr>
       </w:pPr>
       <w:r>
         <w:rPr>
           <w:i/>
           <w:iCs/>
-          <w:sz w:val="21"/>
-          <w:szCs w:val="20"/>
+          <w:sz w:val="20"/>
+          <w:szCs w:val="18"/>
         </w:rPr>
         <w:t>Figur 16. MAE per måned i testperioden for de fire modellene. Figuren viser hvordan modellytelsen varierer over tid, ikke bare samlet.</w:t>
       </w:r>
@@ -24007,16 +23974,16 @@
         <w:rPr>
           <w:i/>
           <w:iCs/>
-          <w:sz w:val="22"/>
-          <w:szCs w:val="22"/>
+          <w:sz w:val="20"/>
+          <w:szCs w:val="18"/>
         </w:rPr>
       </w:pPr>
       <w:r>
         <w:rPr>
           <w:i/>
           <w:iCs/>
-          <w:sz w:val="22"/>
-          <w:szCs w:val="22"/>
+          <w:sz w:val="20"/>
+          <w:szCs w:val="18"/>
         </w:rPr>
         <w:t>Figur 17. Heatmap som viser MAE per fartøy og modell i testperioden. Mørkere felt indikerer høyere prediksjonsfeil.</w:t>
       </w:r>
@@ -24040,15 +24007,22 @@
       </w:r>
       <w:proofErr w:type="spellEnd"/>
       <w:r>
-        <w:t xml:space="preserve"> best samlet testytelse i dette datasettet. For det andre presterer XGBoost og LSTM konkurransedyktig, men uten å gi en tydelig gevinst over den beste klassiske modellen. For det tredje varierer feilene mer mellom fartøy enn mellom modeller, noe som viser at samlet modellrangering i stor grad påvirkes av de mest krevende fartøy</w:t>
+        <w:t xml:space="preserve"> best samlet testytelse i dette datasettet. For det andre presterer XGBoost og LSTM konkurransedyktig, men uten å gi en tydelig gevinst over den beste klassiske modellen. For det tredje varierer feilene mer mellom fartøy</w:t>
       </w:r>
       <w:r>
         <w:t>ene</w:t>
       </w:r>
       <w:r>
+        <w:t xml:space="preserve"> enn mellom modeller, noe som viser at samlet modellrangering i stor grad påvirkes av de mest krevende fartøy</w:t>
+      </w:r>
+      <w:r>
+        <w:t>ene</w:t>
+      </w:r>
+      <w:r>
         <w:t>.</w:t>
       </w:r>
     </w:p>
+    <w:p/>
     <w:p/>
     <w:p>
       <w:pPr>
@@ -27077,7 +27051,7 @@
         <w:spacing w:line="360" w:lineRule="auto"/>
       </w:pPr>
       <w:r>
-        <w:t xml:space="preserve">Dette funnet er faglig interessant fordi det nyanserer en vanlig forventning om at KI-baserte modeller nødvendigvis vil prestere best når datagrunnlaget er komplekst. Resultatene viser i stedet at det ikke er modellens kompleksitet alene som avgjør prediksjonsnøyaktigheten, men hvor godt modellstrukturen passer til datagrunnlaget og prognoseproblemet. Dette samsvarer med </w:t>
+        <w:t xml:space="preserve">Dette funnet er interessant fordi det nyanserer en vanlig forventning om at KI-baserte modeller nødvendigvis vil prestere best når datagrunnlaget er komplekst. Resultatene viser i stedet at det ikke er modellens kompleksitet alene som avgjør prediksjonsnøyaktigheten, men hvor godt modellstrukturen passer til datagrunnlaget og prognoseproblemet. Dette samsvarer med </w:t>
       </w:r>
       <w:proofErr w:type="spellStart"/>
       <w:r>
@@ -28063,15 +28037,7 @@
       </w:r>
       <w:proofErr w:type="spellEnd"/>
       <w:r>
-        <w:t xml:space="preserve">. På 6 og særlig 12 måneders horisont bør prognosene i større grad forstås som usikre modellbaner eller </w:t>
-      </w:r>
-      <w:proofErr w:type="spellStart"/>
-      <w:r>
-        <w:t>scenarioaktige</w:t>
-      </w:r>
-      <w:proofErr w:type="spellEnd"/>
-      <w:r>
-        <w:t xml:space="preserve"> indikasjoner. Dette er særlig viktig fordi studien ikke inkluderer eksterne forklaringsvariabler som </w:t>
+        <w:t xml:space="preserve">. På 6 og særlig 12 måneders horisont bør prognosene i større grad forstås som usikre modellbaner eller scenario indikasjoner. Dette er særlig viktig fordi studien ikke inkluderer eksterne forklaringsvariabler som </w:t>
       </w:r>
       <w:proofErr w:type="spellStart"/>
       <w:r>
@@ -28251,7 +28217,7 @@
         <w:spacing w:line="360" w:lineRule="auto"/>
       </w:pPr>
       <w:r>
-        <w:t xml:space="preserve">For det tredje er den historiske modelltesten tydelig adskilt fra fremtidsprognosene. Dette er en viktig fordi det skiller mellom verifiserbar modellprestasjon og ikke-verifiserte fremtidsestimater. I den historiske testen kan modellene vurderes mot faktiske observasjoner ved hjelp av MAE, </w:t>
+        <w:t xml:space="preserve">For det tredje er den historiske modelltesten tydelig adskilt fra fremtidsprognosene. Dette er viktig fordi det skiller mellom verifiserbar modellprestasjon og ikke-verifiserte fremtidsestimater. I den historiske testen kan modellene vurderes mot faktiske observasjoner ved hjelp av MAE, </w:t>
       </w:r>
       <w:proofErr w:type="spellStart"/>
       <w:r>
@@ -28314,39 +28280,7 @@
         <w:t xml:space="preserve"> </w:t>
       </w:r>
       <w:r>
-        <w:t xml:space="preserve">Det er også en metodisk begrensning at eksterne forklaringsvariabler ikke er inkludert i modellene. Forhold som </w:t>
-      </w:r>
-      <w:proofErr w:type="spellStart"/>
-      <w:r>
-        <w:t>kontraktsstatus</w:t>
-      </w:r>
-      <w:proofErr w:type="spellEnd"/>
-      <w:r>
-        <w:t xml:space="preserve">, tekniske hendelser, </w:t>
-      </w:r>
-      <w:proofErr w:type="spellStart"/>
-      <w:r>
-        <w:t>vedlikeholdsaktivitet</w:t>
-      </w:r>
-      <w:proofErr w:type="spellEnd"/>
-      <w:r>
-        <w:t xml:space="preserve">, energipriser, ratenivå, markedsaktivitet og geopolitisk uro kan påvirke </w:t>
-      </w:r>
-      <w:proofErr w:type="spellStart"/>
-      <w:r>
-        <w:t>offhire</w:t>
-      </w:r>
-      <w:proofErr w:type="spellEnd"/>
-      <w:r>
-        <w:t xml:space="preserve">, men inngår ikke eksplisitt i analysen. Slike forhold fanges bare opp indirekte dersom effekten allerede er reflektert i historiske </w:t>
-      </w:r>
-      <w:proofErr w:type="spellStart"/>
-      <w:r>
-        <w:t>offhire</w:t>
-      </w:r>
-      <w:proofErr w:type="spellEnd"/>
-      <w:r>
-        <w:t xml:space="preserve">-observasjoner. Dette er særlig viktig for fremtidsprognosene, der usikkerheten øker jo lengre horisonten blir. Modeller som bare bygger på historisk </w:t>
+        <w:t xml:space="preserve">Det er også en metodisk begrensning at eksterne forklaringsvariabler ikke er inkludert i modellene. Dette er særlig viktig for fremtidsprognosene, der usikkerheten øker jo lengre horisonten blir. Modeller som bare bygger på historisk </w:t>
       </w:r>
       <w:proofErr w:type="spellStart"/>
       <w:r>
@@ -28502,11 +28436,7 @@
       </w:r>
       <w:proofErr w:type="spellEnd"/>
       <w:r>
-        <w:t xml:space="preserve"> kan fungere som et forsvarlig førstevalg for kortsiktig </w:t>
-      </w:r>
-      <w:r>
-        <w:lastRenderedPageBreak/>
-        <w:t xml:space="preserve">prognostisering, særlig fordi modellen hadde best historisk testytelse og samtidig er mer transparent enn de KI-baserte modellene. Dette gjør modellen egnet som et mulig basisverktøy for månedlig oppfølging av fartøy med høy historisk </w:t>
+        <w:t xml:space="preserve"> kan fungere som et forsvarlig førstevalg for kortsiktig prognostisering, særlig fordi modellen hadde best historisk testytelse og samtidig er mer transparent enn de KI-baserte modellene. Dette gjør modellen egnet som et mulig basisverktøy for månedlig oppfølging av fartøy med høy historisk </w:t>
       </w:r>
       <w:proofErr w:type="spellStart"/>
       <w:r>
@@ -28523,6 +28453,7 @@
         <w:spacing w:line="360" w:lineRule="auto"/>
       </w:pPr>
       <w:r>
+        <w:lastRenderedPageBreak/>
         <w:t xml:space="preserve">Den praktiske nytten ligger likevel ikke bare i å velge én modell. Like viktig er det at modellene kan brukes til å synliggjøre usikkerhet. Dersom flere modeller peker mot samme fartøy eller samme periode, kan dette gi et sterkere signal om at videre operasjonell vurdering er nødvendig. Dersom modellene derimot spriker kraftig, slik de gjør på lengre prognosehorisonter, bør dette tolkes som et tegn på høy usikkerhet snarere enn som et grunnlag for bastante beslutninger. På denne måten kan modellene brukes som et supplement til faglig vurderinger, ikke som en erstatning for operasjonell erfaring, </w:t>
       </w:r>
       <w:proofErr w:type="spellStart"/>
@@ -28637,6 +28568,12 @@
       <w:r>
         <w:t xml:space="preserve"> som det mest forsvarlige førstevalget basert på historisk testytelse, men resultatene viser også at KI-baserte modeller kan være relevante dersom datagrunnlaget utvides. Den viktigste praktiske implikasjonen er derfor ikke at én modell bør brukes ukritisk, men at prognoser bør inngå som en del av et bredere beslutningsgrunnlag der historiske data, modellresultater og operasjonell kunnskap vurderes samlet.</w:t>
       </w:r>
+    </w:p>
+    <w:p>
+      <w:pPr>
+        <w:pStyle w:val="NormalWeb"/>
+        <w:spacing w:line="360" w:lineRule="auto"/>
+      </w:pPr>
     </w:p>
     <w:p>
       <w:pPr>
@@ -28888,18 +28825,10 @@
       </w:r>
       <w:r>
         <w:lastRenderedPageBreak/>
-        <w:t xml:space="preserve">eksterne forklaringsvariabler som </w:t>
-      </w:r>
-      <w:proofErr w:type="spellStart"/>
-      <w:r>
-        <w:t>kontraktsendringer</w:t>
-      </w:r>
-      <w:proofErr w:type="spellEnd"/>
-      <w:r>
-        <w:t>, tekniske hendelser, energipriser eller markedsforhold.</w:t>
-      </w:r>
-      <w:r>
-        <w:t xml:space="preserve"> </w:t>
+        <w:t>eksterne forklaringsvariabler</w:t>
+      </w:r>
+      <w:r>
+        <w:t xml:space="preserve">. </w:t>
       </w:r>
       <w:r>
         <w:t xml:space="preserve">Oppgavens viktigste bidrag er dermed å vise at modellvalg for </w:t>

</xml_diff>